<commit_message>
W39 Meteor: apply Ran's editorial pass, remove implied fee-analysis capability
Post rewritten to Ran's exact final text (softer hook, visibility/negotiation
framed bullets, "Consolidated fee data is a negotiating position" kept as
the core message). Article aligned to the same correction: bank aggregation
is the approved capability being pitched, not implied fee categorization,
trend detection, or automatic fee-increase alerts. Visual line changed from
extrapolating the AFP benchmark's scale onto every reader to a claim the
data actually supports.

Co-Authored-By: Claude Sonnet 5 <noreply@anthropic.com>
Claude-Session: https://claude.ai/code/session_01CMPhB24ymUwmoZa8aTm7SH
</commit_message>
<xml_diff>
--- a/O-output/W39/final/article-meteor.docx
+++ b/O-output/W39/final/article-meteor.docx
@@ -31,7 +31,7 @@
         <w:rPr>
           <w:b w:val="0"/>
         </w:rPr>
-        <w:t>The timing matters. CFO Dive reports that a Clearing House executive said finance and treasury leaders are prioritizing deeper visibility into payment rails and treasury systems, as business increasingly runs in real time. Fees are rising at the exact moment scrutiny is rising faster.</w:t>
+        <w:t>The timing matters. CFO Dive reports that a Clearing House executive said finance and treasury leaders are prioritizing deeper visibility into payment rails and treasury systems, as business increasingly runs in real time. That broader visibility push reinforces the same pressure on bank fees, even though it is not fee-specific research on its own.</w:t>
       </w:r>
     </w:p>
     <w:p>
@@ -199,7 +199,7 @@
         <w:rPr>
           <w:b w:val="0"/>
         </w:rPr>
-        <w:t>This is exactly where direct bank aggregation becomes critical. Meteor connects directly to all Israeli banks and to more than 150 global banks. That connectivity converts scattered, bank-by-bank statement formats into a single, real-time ledger of fees, transactions, and account activity.</w:t>
+        <w:t>This is exactly where direct bank aggregation becomes critical. Meteor connects directly to all Israeli banks and to more than 150 global banks. That connectivity brings scattered, bank-by-bank statements into one consolidated, current view of transactions and account activity, the foundation treasury needs before it can compare fees at all.</w:t>
       </w:r>
     </w:p>
     <w:p>
@@ -207,7 +207,7 @@
         <w:rPr>
           <w:b w:val="0"/>
         </w:rPr>
-        <w:t>The difference this makes is not cosmetic. It changes what treasury can actually see:</w:t>
+        <w:t>The difference this makes is not cosmetic. It changes what treasury can actually work with:</w:t>
       </w:r>
     </w:p>
     <w:p>
@@ -223,13 +223,13 @@
         <w:rPr>
           <w:b/>
         </w:rPr>
-        <w:t>Fee categories become comparable across banks</w:t>
+        <w:t>All banking activity in one place</w:t>
       </w:r>
       <w:r>
         <w:rPr>
           <w:b w:val="0"/>
         </w:rPr>
-        <w:t>, instead of trapped in each institution's own taxonomy.</w:t>
+        <w:t>, instead of statements trapped in each institution's own format.</w:t>
       </w:r>
     </w:p>
     <w:p>
@@ -245,13 +245,13 @@
         <w:rPr>
           <w:b/>
         </w:rPr>
-        <w:t>Fee trends become visible over time</w:t>
+        <w:t>Current account data, not a quarter-end snapshot</w:t>
       </w:r>
       <w:r>
         <w:rPr>
           <w:b w:val="0"/>
         </w:rPr>
-        <w:t>, instead of discovered retroactively at quarter-end reconciliation.</w:t>
+        <w:t>, so a fee change does not wait for the next reconciliation cycle to surface.</w:t>
       </w:r>
     </w:p>
     <w:p>
@@ -267,13 +267,13 @@
         <w:rPr>
           <w:b/>
         </w:rPr>
-        <w:t>Fee increases become identifiable within days</w:t>
+        <w:t>Multi-entity, multi-currency activity in one view</w:t>
       </w:r>
       <w:r>
         <w:rPr>
           <w:b w:val="0"/>
         </w:rPr>
-        <w:t>, instead of buried in a stack of PDFs reviewed once a quarter.</w:t>
+        <w:t>, instead of a spreadsheet stitched together manually.</w:t>
       </w:r>
     </w:p>
     <w:p>
@@ -289,13 +289,13 @@
         <w:rPr>
           <w:b/>
         </w:rPr>
-        <w:t>Multi-entity, multi-currency exposure becomes one view</w:t>
+        <w:t>A consistent data foundation treasury teams can build fee comparisons and analysis on</w:t>
       </w:r>
       <w:r>
         <w:rPr>
           <w:b w:val="0"/>
         </w:rPr>
-        <w:t>, instead of a spreadsheet stitched together manually.</w:t>
+        <w:t>, rather than starting from scratch with every banking relationship.</w:t>
       </w:r>
     </w:p>
     <w:p>
@@ -319,7 +319,7 @@
         <w:rPr>
           <w:b w:val="0"/>
         </w:rPr>
-        <w:t>Visibility alone is a compliance outcome. Leverage is a commercial outcome. The gap between them is what most fee transparency initiatives miss.</w:t>
+        <w:t>Consolidated fee data is a negotiating position. Scattered statements are not. The gap between them is what most fee transparency initiatives miss.</w:t>
       </w:r>
     </w:p>
     <w:p>
@@ -327,15 +327,17 @@
         <w:rPr>
           <w:b w:val="0"/>
         </w:rPr>
-        <w:t>A consolidated fee ledger lets treasury do three things that scattered statements do not support:</w:t>
+        <w:t>A consolidated, current view of banking activity lets treasury do three things that scattered statements do not support:</w:t>
       </w:r>
     </w:p>
     <w:p>
+      <w:pPr>
+        <w:pStyle w:val="ListBullet"/>
+      </w:pPr>
       <w:r>
         <w:rPr>
           <w:b w:val="0"/>
         </w:rPr>
-        <w:t xml:space="preserve">1. </w:t>
       </w:r>
       <w:r>
         <w:rPr>
@@ -347,7 +349,17 @@
         <w:rPr>
           <w:b w:val="0"/>
         </w:rPr>
-        <w:t xml:space="preserve"> Compare fee structures across banking relationships for functionally similar services, using the same categorization. 2. </w:t>
+        <w:t xml:space="preserve"> Compare costs across banking relationships for functionally similar services, working from one consistent data source instead of reconciling formats bank by bank.</w:t>
+      </w:r>
+    </w:p>
+    <w:p>
+      <w:pPr>
+        <w:pStyle w:val="ListBullet"/>
+      </w:pPr>
+      <w:r>
+        <w:rPr>
+          <w:b w:val="0"/>
+        </w:rPr>
       </w:r>
       <w:r>
         <w:rPr>
@@ -359,7 +371,17 @@
         <w:rPr>
           <w:b w:val="0"/>
         </w:rPr>
-        <w:t xml:space="preserve"> Reference industry data, such as AFP's NDepth-based benchmarks, to confirm whether pricing sits inside or outside a reasonable range. 3. </w:t>
+        <w:t xml:space="preserve"> Reference industry data, such as AFP's NDepth-based benchmarks, to confirm whether pricing sits inside or outside a reasonable range.</w:t>
+      </w:r>
+    </w:p>
+    <w:p>
+      <w:pPr>
+        <w:pStyle w:val="ListBullet"/>
+      </w:pPr>
+      <w:r>
+        <w:rPr>
+          <w:b w:val="0"/>
+        </w:rPr>
       </w:r>
       <w:r>
         <w:rPr>
@@ -371,7 +393,7 @@
         <w:rPr>
           <w:b w:val="0"/>
         </w:rPr>
-        <w:t xml:space="preserve"> Bring specific, dated, categorized fee data into a renewal conversation, rather than a general sense that costs feel high.</w:t>
+        <w:t xml:space="preserve"> Bring specific, dated fee data into a renewal conversation, rather than a general sense that costs feel high.</w:t>
       </w:r>
     </w:p>
     <w:p>
@@ -479,7 +501,7 @@
         <w:rPr>
           <w:b w:val="0"/>
         </w:rPr>
-        <w:t>Meteor's direct connectivity across Israeli and 150+ global banks exists to close exactly that gap. It turns scattered statements into one real-time ledger treasury teams can act on.</w:t>
+        <w:t>Meteor's direct connectivity across Israeli and 150+ global banks exists to close exactly that gap. It replaces scattered, bank-by-bank statements with one consolidated, current view treasury teams can build fee comparisons and renewal conversations on.</w:t>
       </w:r>
     </w:p>
     <w:sectPr>

</xml_diff>